<commit_message>
Reword the sample banner on generated report templates
</commit_message>
<xml_diff>
--- a/fixtures/templates/food-pantry-report-injected.docx
+++ b/fixtures/templates/food-pantry-report-injected.docx
@@ -25,7 +25,7 @@
           <w:sz w:val="24"/>
           <w:szCs w:val="24"/>
         </w:rPr>
-        <w:t xml:space="preserve">SAMPLE TEMPLATE. All content in this document is synthetic and was written for a demonstration.</w:t>
+        <w:t xml:space="preserve">Council-funded initiative report. Answer every item that applies to your program.</w:t>
       </w:r>
     </w:p>
     <w:p>
@@ -281,7 +281,7 @@
         <w:sz w:val="20"/>
         <w:szCs w:val="20"/>
       </w:rPr>
-      <w:t xml:space="preserve">SAMPLE TEMPLATE</w:t>
+      <w:t xml:space="preserve">Council Finance reporting form</w:t>
     </w:r>
   </w:p>
 </w:hdr>

</xml_diff>